<commit_message>
Reordenar colunas: @rgbeac antes de @codigo
https://claude.ai/code/session_01KM4bAsPea1iAvtgRBbYiJf
</commit_message>
<xml_diff>
--- a/tabela_art6_art7_comparativo.docx
+++ b/tabela_art6_art7_comparativo.docx
@@ -26,7 +26,7 @@
           <w:i/>
           <w:sz w:val="18"/>
         </w:rPr>
-        <w:t>Correspondência norma a norma entre as determinações do Regulamento e as propostas @codigo (DL n.º 214/2013) e @rgbeac (proposta, jun. 2025)</w:t>
+        <w:t>Correspondência norma a norma entre as determinações do Regulamento e as propostas @rgbeac (jun. 2025) e @codigo (DL n.º 214/2013)</w:t>
       </w:r>
     </w:p>
     <w:p>
@@ -120,9 +120,9 @@
                 <w:b/>
                 <w:sz w:val="18"/>
               </w:rPr>
-              <w:t>@codigo</w:t>
+              <w:t>@rgbeac</w:t>
               <w:br/>
-              <w:t>(proposta DL n.º 214/2013)</w:t>
+              <w:t>(proposta jun. 2025)</w:t>
             </w:r>
           </w:p>
         </w:tc>
@@ -140,9 +140,9 @@
                 <w:b/>
                 <w:sz w:val="18"/>
               </w:rPr>
-              <w:t>@rgbeac</w:t>
+              <w:t>@codigo</w:t>
               <w:br/>
-              <w:t>(proposta jun. 2025)</w:t>
+              <w:t>(proposta DL n.º 214/2013)</w:t>
             </w:r>
           </w:p>
         </w:tc>
@@ -202,11 +202,11 @@
                 <w:rFonts w:ascii="Arial" w:hAnsi="Arial"/>
                 <w:sz w:val="17"/>
               </w:rPr>
-              <w:t>Art.º 4.º — dever de assegurar as necessidades básicas de bem-estar.</w:t>
+              <w:t>Art.º 7.º, n.º 1, al. a) — proibição de fome, sede ou malnutrição.</w:t>
               <w:br/>
-              <w:t>Art.º 5.º, n.º 1 — condições de detenção e alojamento devem salvaguardar os parâmetros de bem-estar.</w:t>
+              <w:t>Art.º 10.º, n.º 1, al. a), ii) — alimentos saudáveis, adequados e convenientes; acesso permanente a água potável.</w:t>
               <w:br/>
-              <w:t>Sem correspondência explícita a alimentação e hidratação como norma autónoma.</w:t>
+              <w:t>Coberto.</w:t>
             </w:r>
           </w:p>
         </w:tc>
@@ -224,11 +224,11 @@
                 <w:rFonts w:ascii="Arial" w:hAnsi="Arial"/>
                 <w:sz w:val="17"/>
               </w:rPr>
-              <w:t>Art.º 7.º, n.º 1, al. a) — proibição de fome, sede ou malnutrição.</w:t>
+              <w:t>Art.º 4.º — dever de assegurar as necessidades básicas de bem-estar.</w:t>
               <w:br/>
-              <w:t>Art.º 10.º, n.º 1, al. a), ii) — alimentos saudáveis, adequados e convenientes; acesso permanente a água potável.</w:t>
+              <w:t>Art.º 5.º, n.º 1 — condições de detenção e alojamento devem salvaguardar os parâmetros de bem-estar.</w:t>
               <w:br/>
-              <w:t>Coberto.</w:t>
+              <w:t>Sem correspondência explícita a alimentação e hidratação como norma autónoma.</w:t>
             </w:r>
           </w:p>
         </w:tc>
@@ -288,9 +288,11 @@
                 <w:rFonts w:ascii="Arial" w:hAnsi="Arial"/>
                 <w:sz w:val="17"/>
               </w:rPr>
-              <w:t>Art.º 5.º, n.º 1 — condições de detenção devem salvaguardar bem-estar.</w:t>
+              <w:t>Art.º 7.º, n.º 1, al. b) — proibição de desconforto físico ou térmico.</w:t>
               <w:br/>
-              <w:t>Sem enumeração explícita dos parâmetros físicos (ar, temperatura, luz).</w:t>
+              <w:t>Art.º 10.º, n.º 1, al. a), v) — abrigo adequado com proteção de condições atmosféricas adversas (frio, chuva, sol ou calor excessivos); cama seca, limpa e confortável.</w:t>
+              <w:br/>
+              <w:t>Parcialmente coberto (sem referência explícita a qualidade do ar ou iluminação).</w:t>
             </w:r>
           </w:p>
         </w:tc>
@@ -308,11 +310,9 @@
                 <w:rFonts w:ascii="Arial" w:hAnsi="Arial"/>
                 <w:sz w:val="17"/>
               </w:rPr>
-              <w:t>Art.º 7.º, n.º 1, al. b) — proibição de desconforto físico ou térmico.</w:t>
+              <w:t>Art.º 5.º, n.º 1 — condições de detenção devem salvaguardar bem-estar.</w:t>
               <w:br/>
-              <w:t>Art.º 10.º, n.º 1, al. a), v) — abrigo adequado com proteção de condições atmosféricas adversas (frio, chuva, sol ou calor excessivos); cama seca, limpa e confortável.</w:t>
-              <w:br/>
-              <w:t>Parcialmente coberto (sem referência explícita a qualidade do ar ou iluminação).</w:t>
+              <w:t>Sem enumeração explícita dos parâmetros físicos (ar, temperatura, luz).</w:t>
             </w:r>
           </w:p>
         </w:tc>
@@ -372,9 +372,11 @@
                 <w:rFonts w:ascii="Arial" w:hAnsi="Arial"/>
                 <w:sz w:val="17"/>
               </w:rPr>
-              <w:t>Art.º 5.º, n.º 3, al. b) — proibição de restringir a liberdade de movimentos de forma a impedir levantar-se, deitar-se ou virar-se sobre si próprios.</w:t>
+              <w:t>Art.º 10.º, n.º 1, al. a), iv) — liberdade de movimento; proibição de contenção permanente; espaço e enriquecimento ambiental adequados.</w:t>
               <w:br/>
-              <w:t>Sem norma sobre sobrelotação.</w:t>
+              <w:t>Portaria prevista no art.º 58.º fixará requisitos específicos.</w:t>
+              <w:br/>
+              <w:t>Parcialmente coberto (sobrelotação não referenciada de forma autónoma).</w:t>
             </w:r>
           </w:p>
         </w:tc>
@@ -392,11 +394,9 @@
                 <w:rFonts w:ascii="Arial" w:hAnsi="Arial"/>
                 <w:sz w:val="17"/>
               </w:rPr>
-              <w:t>Art.º 10.º, n.º 1, al. a), iv) — liberdade de movimento; proibição de contenção permanente; espaço e enriquecimento ambiental adequados.</w:t>
+              <w:t>Art.º 5.º, n.º 3, al. b) — proibição de restringir a liberdade de movimentos de forma a impedir levantar-se, deitar-se ou virar-se sobre si próprios.</w:t>
               <w:br/>
-              <w:t>Portaria prevista no art.º 58.º fixará requisitos específicos.</w:t>
-              <w:br/>
-              <w:t>Parcialmente coberto (sobrelotação não referenciada de forma autónoma).</w:t>
+              <w:t>Sem norma sobre sobrelotação.</w:t>
             </w:r>
           </w:p>
         </w:tc>
@@ -456,11 +456,13 @@
                 <w:rFonts w:ascii="Arial" w:hAnsi="Arial"/>
                 <w:sz w:val="17"/>
               </w:rPr>
-              <w:t>Art.º 4.º — dever de salvaguardar a saúde.</w:t>
+              <w:t>Art.º 7.º, n.º 1, al. c) — proibição de dor, lesão física ou doença.</w:t>
               <w:br/>
-              <w:t>Art.º 6.º — dever de assegurar cuidados médico-veterinários ao animal ferido ou doente.</w:t>
+              <w:t>Art.º 10.º, n.º 1, al. a), iii) — condições higiossanitárias.</w:t>
               <w:br/>
-              <w:t>Coberto em termos gerais.</w:t>
+              <w:t>Art.º 10.º, n.º 1, al. f) — tratamento veterinário preventivo, paliativo ou curativo.</w:t>
+              <w:br/>
+              <w:t>Coberto.</w:t>
             </w:r>
           </w:p>
         </w:tc>
@@ -478,13 +480,11 @@
                 <w:rFonts w:ascii="Arial" w:hAnsi="Arial"/>
                 <w:sz w:val="17"/>
               </w:rPr>
-              <w:t>Art.º 7.º, n.º 1, al. c) — proibição de dor, lesão física ou doença.</w:t>
+              <w:t>Art.º 4.º — dever de salvaguardar a saúde.</w:t>
               <w:br/>
-              <w:t>Art.º 10.º, n.º 1, al. a), iii) — condições higiossanitárias.</w:t>
+              <w:t>Art.º 6.º — dever de assegurar cuidados médico-veterinários ao animal ferido ou doente.</w:t>
               <w:br/>
-              <w:t>Art.º 10.º, n.º 1, al. f) — tratamento veterinário preventivo, paliativo ou curativo.</w:t>
-              <w:br/>
-              <w:t>Coberto.</w:t>
+              <w:t>Coberto em termos gerais.</w:t>
             </w:r>
           </w:p>
         </w:tc>
@@ -544,9 +544,9 @@
                 <w:rFonts w:ascii="Arial" w:hAnsi="Arial"/>
                 <w:sz w:val="17"/>
               </w:rPr>
-              <w:t>Art.º 5.º, n.º 3, al. c) — proibição de usar equipamentos de maneio, contenção ou treino que causem sofrimento desnecessário ou lesões.</w:t>
+              <w:t>Art.º 12.º, n.º 1, al. b) — proibição de práticas que causem sofrimento, dano, stresse ou angústia.</w:t>
               <w:br/>
-              <w:t>Art.º 8.º, n.º 1 e 2 — reprodução planeada e parâmetros reprodutivos.</w:t>
+              <w:t>Art.º 70.º (normas reprodutivas) — limitações à reprodução para proteção da saúde.</w:t>
               <w:br/>
               <w:t>Coberto de forma dispersa.</w:t>
             </w:r>
@@ -566,9 +566,9 @@
                 <w:rFonts w:ascii="Arial" w:hAnsi="Arial"/>
                 <w:sz w:val="17"/>
               </w:rPr>
-              <w:t>Art.º 12.º, n.º 1, al. b) — proibição de práticas que causem sofrimento, dano, stresse ou angústia.</w:t>
+              <w:t>Art.º 5.º, n.º 3, al. c) — proibição de usar equipamentos de maneio, contenção ou treino que causem sofrimento desnecessário ou lesões.</w:t>
               <w:br/>
-              <w:t>Art.º 70.º (normas reprodutivas) — limitações à reprodução para proteção da saúde.</w:t>
+              <w:t>Art.º 8.º, n.º 1 e 2 — reprodução planeada e parâmetros reprodutivos.</w:t>
               <w:br/>
               <w:t>Coberto de forma dispersa.</w:t>
             </w:r>
@@ -630,9 +630,13 @@
                 <w:rFonts w:ascii="Arial" w:hAnsi="Arial"/>
                 <w:sz w:val="17"/>
               </w:rPr>
-              <w:t>Art.º 5.º, n.º 1 — condições de detenção que salvaguardem parâmetros de bem-estar (sem menção explícita a comportamentos específicos da espécie).</w:t>
+              <w:t>Art.º 7.º, n.º 1, al. d) — direito de expressar padrões normais de comportamento.</w:t>
               <w:br/>
-              <w:t>Não coberto de forma explícita.</w:t>
+              <w:t>Art.º 10.º, n.º 1, al. a), iv) — espaço e enriquecimento ambiental adequados para a expressão dos comportamentos naturais.</w:t>
+              <w:br/>
+              <w:t>Art.º 10.º, n.º 1, al. a), vi) — contato social adequado à espécie, de acordo com a idade e atividade.</w:t>
+              <w:br/>
+              <w:t>Coberto.</w:t>
             </w:r>
           </w:p>
         </w:tc>
@@ -650,13 +654,9 @@
                 <w:rFonts w:ascii="Arial" w:hAnsi="Arial"/>
                 <w:sz w:val="17"/>
               </w:rPr>
-              <w:t>Art.º 7.º, n.º 1, al. d) — direito de expressar padrões normais de comportamento.</w:t>
+              <w:t>Art.º 5.º, n.º 1 — condições de detenção que salvaguardem parâmetros de bem-estar (sem menção explícita a comportamentos específicos da espécie).</w:t>
               <w:br/>
-              <w:t>Art.º 10.º, n.º 1, al. a), iv) — espaço e enriquecimento ambiental adequados para a expressão dos comportamentos naturais.</w:t>
-              <w:br/>
-              <w:t>Art.º 10.º, n.º 1, al. a), vi) — contato social adequado à espécie, de acordo com a idade e atividade.</w:t>
-              <w:br/>
-              <w:t>Coberto.</w:t>
+              <w:t>Não coberto de forma explícita.</w:t>
             </w:r>
           </w:p>
         </w:tc>
@@ -716,11 +716,9 @@
                 <w:rFonts w:ascii="Arial" w:hAnsi="Arial"/>
                 <w:sz w:val="17"/>
               </w:rPr>
-              <w:t>Art.º 7.º, n.º 1 — dever de promover o treino dos cães com vista à socialização e obediência.</w:t>
+              <w:t>Art.º 10.º, n.º 1, al. c) — dever de educar o animal com recurso a métodos de reforço positivo visando a sua vinculação e integração positivas no espaço familiar e no meio ambiente.</w:t>
               <w:br/>
-              <w:t>Art.º 7.º, n.º 2 — treino de acordo com boas práticas.</w:t>
-              <w:br/>
-              <w:t>Parcialmente coberto (apenas cães; sem referência explícita a relação positiva).</w:t>
+              <w:t>Coberto.</w:t>
             </w:r>
           </w:p>
         </w:tc>
@@ -738,9 +736,11 @@
                 <w:rFonts w:ascii="Arial" w:hAnsi="Arial"/>
                 <w:sz w:val="17"/>
               </w:rPr>
-              <w:t>Art.º 10.º, n.º 1, al. c) — dever de educar o animal com recurso a métodos de reforço positivo visando a sua vinculação e integração positivas no espaço familiar e no meio ambiente.</w:t>
+              <w:t>Art.º 7.º, n.º 1 — dever de promover o treino dos cães com vista à socialização e obediência.</w:t>
               <w:br/>
-              <w:t>Coberto.</w:t>
+              <w:t>Art.º 7.º, n.º 2 — treino de acordo com boas práticas.</w:t>
+              <w:br/>
+              <w:t>Parcialmente coberto (apenas cães; sem referência explícita a relação positiva).</w:t>
             </w:r>
           </w:p>
         </w:tc>
@@ -800,9 +800,11 @@
                 <w:rFonts w:ascii="Arial" w:hAnsi="Arial"/>
                 <w:sz w:val="17"/>
               </w:rPr>
-              <w:t>Art.º 5.º, n.º 3 — proibição de violência e sofrimento.</w:t>
+              <w:t>Art.º 7.º, n.º 1, al. e) — proibição de situações que provoquem stresse, medo ou ansiedade injustificados.</w:t>
               <w:br/>
-              <w:t>Sem referência explícita à gestão de estímulos negativos.</w:t>
+              <w:t>Art.º 12.º, n.º 1, al. b) — proibição de práticas que causem sofrimento, dano, stresse ou angústia.</w:t>
+              <w:br/>
+              <w:t>Parcialmente coberto (abordagem proibitiva; não preventiva).</w:t>
             </w:r>
           </w:p>
         </w:tc>
@@ -820,11 +822,9 @@
                 <w:rFonts w:ascii="Arial" w:hAnsi="Arial"/>
                 <w:sz w:val="17"/>
               </w:rPr>
-              <w:t>Art.º 7.º, n.º 1, al. e) — proibição de situações que provoquem stresse, medo ou ansiedade injustificados.</w:t>
+              <w:t>Art.º 5.º, n.º 3 — proibição de violência e sofrimento.</w:t>
               <w:br/>
-              <w:t>Art.º 12.º, n.º 1, al. b) — proibição de práticas que causem sofrimento, dano, stresse ou angústia.</w:t>
-              <w:br/>
-              <w:t>Parcialmente coberto (abordagem proibitiva; não preventiva).</w:t>
+              <w:t>Sem referência explícita à gestão de estímulos negativos.</w:t>
             </w:r>
           </w:p>
         </w:tc>
@@ -884,9 +884,9 @@
                 <w:rFonts w:ascii="Arial" w:hAnsi="Arial"/>
                 <w:sz w:val="17"/>
               </w:rPr>
-              <w:t>Art.º 5.º, n.º 4 — proibição de fins didáticos e lúdicos que causem sofrimento.</w:t>
+              <w:t>Art.º 10.º, n.º 1, al. a), i) — dever de proporcionar atenção, supervisão, controlo, exercício físico e estímulo mental.</w:t>
               <w:br/>
-              <w:t>Sem norma positiva sobre estímulos positivos.</w:t>
+              <w:t>Parcialmente coberto.</w:t>
             </w:r>
           </w:p>
         </w:tc>
@@ -904,9 +904,9 @@
                 <w:rFonts w:ascii="Arial" w:hAnsi="Arial"/>
                 <w:sz w:val="17"/>
               </w:rPr>
-              <w:t>Art.º 10.º, n.º 1, al. a), i) — dever de proporcionar atenção, supervisão, controlo, exercício físico e estímulo mental.</w:t>
+              <w:t>Art.º 5.º, n.º 4 — proibição de fins didáticos e lúdicos que causem sofrimento.</w:t>
               <w:br/>
-              <w:t>Parcialmente coberto.</w:t>
+              <w:t>Sem norma positiva sobre estímulos positivos.</w:t>
             </w:r>
           </w:p>
         </w:tc>
@@ -967,6 +967,8 @@
                 <w:sz w:val="17"/>
               </w:rPr>
               <w:t>Não regulado explicitamente.</w:t>
+              <w:br/>
+              <w:t>(O art.º 7.º, n.º 1, al. d) e e) do @rgbeac indiretamente impõem condições que previnem o seu aparecimento, mas sem norma autónoma.)</w:t>
             </w:r>
           </w:p>
         </w:tc>
@@ -985,8 +987,6 @@
                 <w:sz w:val="17"/>
               </w:rPr>
               <w:t>Não regulado explicitamente.</w:t>
-              <w:br/>
-              <w:t>(O art.º 7.º, n.º 1, al. d) e e) do @rgbeac indiretamente impõem condições que previnem o seu aparecimento, mas sem norma autónoma.)</w:t>
             </w:r>
           </w:p>
         </w:tc>
@@ -1046,7 +1046,9 @@
                 <w:rFonts w:ascii="Arial" w:hAnsi="Arial"/>
                 <w:sz w:val="17"/>
               </w:rPr>
-              <w:t>Art.º 4.º — necessidades básicas de bem-estar (sem referência à individualidade do animal).</w:t>
+              <w:t>Art.º 10.º, n.º 1, al. a) — bem-estar assegurado "de acordo com a sua espécie, raça, idade e necessidades físicas e etológicas".</w:t>
+              <w:br/>
+              <w:t>Parcialmente coberto (necessidades da espécie/raça/idade; não explicitamente individuais).</w:t>
             </w:r>
           </w:p>
         </w:tc>
@@ -1064,9 +1066,7 @@
                 <w:rFonts w:ascii="Arial" w:hAnsi="Arial"/>
                 <w:sz w:val="17"/>
               </w:rPr>
-              <w:t>Art.º 10.º, n.º 1, al. a) — bem-estar assegurado "de acordo com a sua espécie, raça, idade e necessidades físicas e etológicas".</w:t>
-              <w:br/>
-              <w:t>Parcialmente coberto (necessidades da espécie/raça/idade; não explicitamente individuais).</w:t>
+              <w:t>Art.º 4.º — necessidades básicas de bem-estar (sem referência à individualidade do animal).</w:t>
             </w:r>
           </w:p>
         </w:tc>
@@ -1152,9 +1152,9 @@
                 <w:b/>
                 <w:sz w:val="18"/>
               </w:rPr>
-              <w:t>@codigo</w:t>
+              <w:t>@rgbeac</w:t>
               <w:br/>
-              <w:t>(proposta DL n.º 214/2013)</w:t>
+              <w:t>(proposta jun. 2025)</w:t>
             </w:r>
           </w:p>
         </w:tc>
@@ -1172,9 +1172,9 @@
                 <w:b/>
                 <w:sz w:val="18"/>
               </w:rPr>
-              <w:t>@rgbeac</w:t>
+              <w:t>@codigo</w:t>
               <w:br/>
-              <w:t>(proposta jun. 2025)</w:t>
+              <w:t>(proposta DL n.º 214/2013)</w:t>
             </w:r>
           </w:p>
         </w:tc>
@@ -1234,9 +1234,11 @@
                 <w:rFonts w:ascii="Arial" w:hAnsi="Arial"/>
                 <w:sz w:val="17"/>
               </w:rPr>
-              <w:t>Art.º 4.º — detenção responsável: cabe aos detentores assegurar as necessidades básicas de bem-estar e salvaguardar a saúde.</w:t>
+              <w:t>Art.º 9.º, n.º 1 — dever geral de todos os cidadãos de notificar infrações.</w:t>
               <w:br/>
-              <w:t>Sem atribuição explícita de responsabilidade ao "operador" como sujeito autónomo de estabelecimento.</w:t>
+              <w:t>Art.º 10.º, n.º 1 — obrigações especiais dos detentores: assegurar bem-estar.</w:t>
+              <w:br/>
+              <w:t>Sem distinção entre detentor doméstico e operador de estabelecimento comercial.</w:t>
               <w:br/>
               <w:t>Parcialmente coberto.</w:t>
             </w:r>
@@ -1256,11 +1258,9 @@
                 <w:rFonts w:ascii="Arial" w:hAnsi="Arial"/>
                 <w:sz w:val="17"/>
               </w:rPr>
-              <w:t>Art.º 9.º, n.º 1 — dever geral de todos os cidadãos de notificar infrações.</w:t>
+              <w:t>Art.º 4.º — detenção responsável: cabe aos detentores assegurar as necessidades básicas de bem-estar e salvaguardar a saúde.</w:t>
               <w:br/>
-              <w:t>Art.º 10.º, n.º 1 — obrigações especiais dos detentores: assegurar bem-estar.</w:t>
-              <w:br/>
-              <w:t>Sem distinção entre detentor doméstico e operador de estabelecimento comercial.</w:t>
+              <w:t>Sem atribuição explícita de responsabilidade ao "operador" como sujeito autónomo de estabelecimento.</w:t>
               <w:br/>
               <w:t>Parcialmente coberto.</w:t>
             </w:r>
@@ -1322,9 +1322,13 @@
                 <w:rFonts w:ascii="Arial" w:hAnsi="Arial"/>
                 <w:sz w:val="17"/>
               </w:rPr>
-              <w:t>Art.º 9.º — define abandono; não prevê o conceito de família de acolhimento.</w:t>
+              <w:t>Art.º 4.º — define "Família de acolhimento temporário" como detentor transitório (45 dias, extensível).</w:t>
               <w:br/>
-              <w:t>Não coberto.</w:t>
+              <w:t>Art.º 101.º, n.ºs 3 e 4 — contrato escrito entre titular e família; registo no SIAC.</w:t>
+              <w:br/>
+              <w:t>Art.º 101.º, n.º 5 — destino do animal é da responsabilidade do titular.</w:t>
+              <w:br/>
+              <w:t>Parcialmente coberto (responsabilidade no titular; mas não se fixa o dever de informação ao acolhedor sobre bem-estar e necessidades individuais).</w:t>
             </w:r>
           </w:p>
         </w:tc>
@@ -1342,13 +1346,9 @@
                 <w:rFonts w:ascii="Arial" w:hAnsi="Arial"/>
                 <w:sz w:val="17"/>
               </w:rPr>
-              <w:t>Art.º 4.º — define "Família de acolhimento temporário" como detentor transitório (45 dias, extensível).</w:t>
+              <w:t>Art.º 9.º — define abandono; não prevê o conceito de família de acolhimento.</w:t>
               <w:br/>
-              <w:t>Art.º 101.º, n.ºs 3 e 4 — contrato escrito entre titular e família; registo no SIAC.</w:t>
-              <w:br/>
-              <w:t>Art.º 101.º, n.º 5 — destino do animal é da responsabilidade do titular.</w:t>
-              <w:br/>
-              <w:t>Parcialmente coberto (responsabilidade no titular; mas não se fixa o dever de informação ao acolhedor sobre bem-estar e necessidades individuais).</w:t>
+              <w:t>Não coberto.</w:t>
             </w:r>
           </w:p>
         </w:tc>
@@ -1408,7 +1408,9 @@
                 <w:rFonts w:ascii="Arial" w:hAnsi="Arial"/>
                 <w:sz w:val="17"/>
               </w:rPr>
-              <w:t>Não regulado.</w:t>
+              <w:t>Art.º 101.º — acolhimento temporário: sem fixação de limite numérico de animais por família.</w:t>
+              <w:br/>
+              <w:t>Não coberto.</w:t>
             </w:r>
           </w:p>
         </w:tc>
@@ -1426,9 +1428,7 @@
                 <w:rFonts w:ascii="Arial" w:hAnsi="Arial"/>
                 <w:sz w:val="17"/>
               </w:rPr>
-              <w:t>Art.º 101.º — acolhimento temporário: sem fixação de limite numérico de animais por família.</w:t>
-              <w:br/>
-              <w:t>Não coberto.</w:t>
+              <w:t>Não regulado.</w:t>
             </w:r>
           </w:p>
         </w:tc>
@@ -1566,9 +1566,11 @@
                 <w:rFonts w:ascii="Arial" w:hAnsi="Arial"/>
                 <w:sz w:val="17"/>
               </w:rPr>
-              <w:t>Art.º 5.º, n.º 3 — proibição de violência: atos que infligem, sem necessidade, morte, sofrimento, abuso ou lesões a um animal.</w:t>
+              <w:t>Art.º 12.º, n.º 1, al. a) — proibição de causar a morte em violação das normas.</w:t>
               <w:br/>
-              <w:t>Art.º 5.º, n.º 4 — proibição de fins didáticos e lúdicos com dor ou sofrimentos consideráveis.</w:t>
+              <w:t>Art.º 12.º, n.º 1, al. b) — proibição de práticas que causem sofrimento, dano, stresse ou angústia.</w:t>
+              <w:br/>
+              <w:t>Art.º 12.º, n.º 1, al. t) — proibição de utilização em eventos que envolvam crueldade, maus-tratos, sofrimento ou morte.</w:t>
               <w:br/>
               <w:t>Coberto.</w:t>
             </w:r>
@@ -1588,11 +1590,9 @@
                 <w:rFonts w:ascii="Arial" w:hAnsi="Arial"/>
                 <w:sz w:val="17"/>
               </w:rPr>
-              <w:t>Art.º 12.º, n.º 1, al. a) — proibição de causar a morte em violação das normas.</w:t>
+              <w:t>Art.º 5.º, n.º 3 — proibição de violência: atos que infligem, sem necessidade, morte, sofrimento, abuso ou lesões a um animal.</w:t>
               <w:br/>
-              <w:t>Art.º 12.º, n.º 1, al. b) — proibição de práticas que causem sofrimento, dano, stresse ou angústia.</w:t>
-              <w:br/>
-              <w:t>Art.º 12.º, n.º 1, al. t) — proibição de utilização em eventos que envolvam crueldade, maus-tratos, sofrimento ou morte.</w:t>
+              <w:t>Art.º 5.º, n.º 4 — proibição de fins didáticos e lúdicos com dor ou sofrimentos consideráveis.</w:t>
               <w:br/>
               <w:t>Coberto.</w:t>
             </w:r>
@@ -1654,9 +1654,11 @@
                 <w:rFonts w:ascii="Arial" w:hAnsi="Arial"/>
                 <w:sz w:val="17"/>
               </w:rPr>
-              <w:t>Art.º 9.º — define abandono; não estabelece proibição autónoma expressa (proibição implícita pela definição).</w:t>
+              <w:t>Art.º 12.º, n.º 1, al. e) — proibição expressa de abandono.</w:t>
               <w:br/>
-              <w:t>Parcialmente coberto.</w:t>
+              <w:t>Art.º 9.º, n.º 1 — dever de notificação de infrações (inclui abandono).</w:t>
+              <w:br/>
+              <w:t>Coberto.</w:t>
             </w:r>
           </w:p>
         </w:tc>
@@ -1674,11 +1676,9 @@
                 <w:rFonts w:ascii="Arial" w:hAnsi="Arial"/>
                 <w:sz w:val="17"/>
               </w:rPr>
-              <w:t>Art.º 12.º, n.º 1, al. e) — proibição expressa de abandono.</w:t>
+              <w:t>Art.º 9.º — define abandono; não estabelece proibição autónoma expressa (proibição implícita pela definição).</w:t>
               <w:br/>
-              <w:t>Art.º 9.º, n.º 1 — dever de notificação de infrações (inclui abandono).</w:t>
-              <w:br/>
-              <w:t>Coberto.</w:t>
+              <w:t>Parcialmente coberto.</w:t>
             </w:r>
           </w:p>
         </w:tc>
@@ -1738,7 +1738,9 @@
                 <w:rFonts w:ascii="Arial" w:hAnsi="Arial"/>
                 <w:sz w:val="17"/>
               </w:rPr>
-              <w:t>Não regulado.</w:t>
+              <w:t>Art.º 101.º, n.º 5 — destino do animal é da responsabilidade do titular; mas esta norma aplica-se ao acolhimento temporário, não ao encerramento de estabelecimento.</w:t>
+              <w:br/>
+              <w:t>Não coberto (para encerramento de estabelecimento comercial).</w:t>
             </w:r>
           </w:p>
         </w:tc>
@@ -1756,9 +1758,7 @@
                 <w:rFonts w:ascii="Arial" w:hAnsi="Arial"/>
                 <w:sz w:val="17"/>
               </w:rPr>
-              <w:t>Art.º 101.º, n.º 5 — destino do animal é da responsabilidade do titular; mas esta norma aplica-se ao acolhimento temporário, não ao encerramento de estabelecimento.</w:t>
-              <w:br/>
-              <w:t>Não coberto (para encerramento de estabelecimento comercial).</w:t>
+              <w:t>Não regulado.</w:t>
             </w:r>
           </w:p>
         </w:tc>
@@ -1818,7 +1818,9 @@
                 <w:rFonts w:ascii="Arial" w:hAnsi="Arial"/>
                 <w:sz w:val="17"/>
               </w:rPr>
-              <w:t>Não regulado (o @codigo não define "cuidador de animais" como sujeito de obrigações autónomas).</w:t>
+              <w:t>Não regulado de forma explícita.</w:t>
+              <w:br/>
+              <w:t>(O @rgbeac prevê deveres do detentor — art.º 10.º — mas não aborda o número de cuidadores por estabelecimento ou as suas competências técnicas específicas.)</w:t>
             </w:r>
           </w:p>
         </w:tc>
@@ -1836,9 +1838,7 @@
                 <w:rFonts w:ascii="Arial" w:hAnsi="Arial"/>
                 <w:sz w:val="17"/>
               </w:rPr>
-              <w:t>Não regulado de forma explícita.</w:t>
-              <w:br/>
-              <w:t>(O @rgbeac prevê deveres do detentor — art.º 10.º — mas não aborda o número de cuidadores por estabelecimento ou as suas competências técnicas específicas.)</w:t>
+              <w:t>Não regulado (o @codigo não define "cuidador de animais" como sujeito de obrigações autónomas).</w:t>
             </w:r>
           </w:p>
         </w:tc>
@@ -1900,9 +1900,9 @@
                 <w:rFonts w:ascii="Arial" w:hAnsi="Arial"/>
                 <w:sz w:val="17"/>
               </w:rPr>
-              <w:t>Não regulado.</w:t>
+              <w:t>Não regulado explicitamente.</w:t>
               <w:br/>
-              <w:t>(O @codigo não prevê indicadores de bem-estar baseados nos animais nem obrigação de monitorização sistemática.)</w:t>
+              <w:t>(O @rgbeac prevê obrigação geral de vigiar o animal — art.º 10.º, n.º 1, al. b) — mas sem sistema de indicadores formais nem obrigação de ação baseada em resultados.)</w:t>
             </w:r>
           </w:p>
         </w:tc>
@@ -1920,9 +1920,9 @@
                 <w:rFonts w:ascii="Arial" w:hAnsi="Arial"/>
                 <w:sz w:val="17"/>
               </w:rPr>
-              <w:t>Não regulado explicitamente.</w:t>
+              <w:t>Não regulado.</w:t>
               <w:br/>
-              <w:t>(O @rgbeac prevê obrigação geral de vigiar o animal — art.º 10.º, n.º 1, al. b) — mas sem sistema de indicadores formais nem obrigação de ação baseada em resultados.)</w:t>
+              <w:t>(O @codigo não prevê indicadores de bem-estar baseados nos animais nem obrigação de monitorização sistemática.)</w:t>
             </w:r>
           </w:p>
         </w:tc>

</xml_diff>